<commit_message>
feat(generador): automatizar documentos Fase 2 (participantes y desierto #1)
Co-authored-by: Cursor <cursoragent@cursor.com>
</commit_message>
<xml_diff>
--- a/src/generador-documentos/templates/acta-apertura-sobres-template.docx
+++ b/src/generador-documentos/templates/acta-apertura-sobres-template.docx
@@ -5,7 +5,7 @@
     <w:p>
       <w:pPr>
         <w:shd w:fill="ffffff" w:val="clear"/>
-        <w:spacing w:after="0" w:before="220" w:line="276" w:lineRule="auto"/>
+        <w:spacing w:after="0" w:before="200" w:line="240" w:lineRule="auto"/>
         <w:jc w:val="center"/>
         <w:rPr>
           <w:b w:val="1"/>
@@ -24,69 +24,6 @@
           <w:szCs w:val="24"/>
           <w:rtl w:val="0"/>
         </w:rPr>
-        <w:t xml:space="preserve">REPÚBLICA BOLIVARIANA DE VENEZUELA</w:t>
-        <w:br w:type="textWrapping"/>
-        <w:t xml:space="preserve">{nom_ente_contratante}</w:t>
-      </w:r>
-      <w:r>
-        <w:rPr>
-          <w:b w:val="1"/>
-          <w:bCs w:val="1"/>
-          <w:color w:val="1a1c1e"/>
-          <w:sz w:val="24"/>
-          <w:szCs w:val="24"/>
-          <w:rtl w:val="0"/>
-        </w:rPr>
-        <w:br w:type="textWrapping"/>
-      </w:r>
-      <w:r>
-        <w:rPr>
-          <w:b w:val="1"/>
-          <w:bCs w:val="1"/>
-          <w:color w:val="1a1c1e"/>
-          <w:sz w:val="24"/>
-          <w:szCs w:val="24"/>
-          <w:rtl w:val="0"/>
-        </w:rPr>
-        <w:t xml:space="preserve">COMISIÓN DE CONTRATACIONES PÚBLICAS</w:t>
-      </w:r>
-    </w:p>
-    <w:p>
-      <w:pPr>
-        <w:shd w:fill="ffffff" w:val="clear"/>
-        <w:spacing w:after="280" w:before="0" w:line="342.85714285714283" w:lineRule="auto"/>
-        <w:jc w:val="center"/>
-        <w:rPr>
-          <w:b w:val="1"/>
-          <w:bCs w:val="1"/>
-          <w:color w:val="1a1c1e"/>
-          <w:sz w:val="24"/>
-          <w:szCs w:val="24"/>
-        </w:rPr>
-      </w:pPr>
-      <w:r>
-        <w:rPr>
-          <w:b w:val="1"/>
-          <w:bCs w:val="1"/>
-          <w:color w:val="1a1c1e"/>
-          <w:sz w:val="24"/>
-          <w:szCs w:val="24"/>
-          <w:rtl w:val="0"/>
-        </w:rPr>
-        <w:t xml:space="preserve">{desc_objeto_contratacion}</w:t>
-        <w:br w:type="textWrapping"/>
-        <w:t xml:space="preserve">N° {cod_nomenclatura_proceso}</w:t>
-      </w:r>
-      <w:r>
-        <w:rPr>
-          <w:b w:val="1"/>
-          <w:bCs w:val="1"/>
-          <w:color w:val="1a1c1e"/>
-          <w:sz w:val="24"/>
-          <w:szCs w:val="24"/>
-          <w:rtl w:val="0"/>
-        </w:rPr>
-        <w:br w:type="textWrapping"/>
         <w:t xml:space="preserve">ACTA DE APERTURA DE SOBRES</w:t>
       </w:r>
     </w:p>
@@ -280,7 +217,7 @@
           <w:szCs w:val="24"/>
           <w:rtl w:val="0"/>
         </w:rPr>
-        <w:t xml:space="preserve">{cedula_miembro_juridico}</w:t>
+        <w:t xml:space="preserve">{cedula_miembro_juridica}</w:t>
       </w:r>
       <w:r>
         <w:rPr>
@@ -688,23 +625,6 @@
           <w:rtl w:val="0"/>
         </w:rPr>
         <w:t xml:space="preserve">de conformidad con la Ley, se procedió a la apertura de los sobres consignados en el acto de recepción previo, anunciando en voz alta el contenido y el monto de cada oferta. A continuación, se deja constancia de los resultados:</w:t>
-      </w:r>
-    </w:p>
-    <w:p>
-      <w:pPr>
-        <w:shd w:fill="ffffff" w:val="clear"/>
-        <w:spacing w:after="280" w:before="220" w:line="342.85714285714283" w:lineRule="auto"/>
-        <w:jc w:val="both"/>
-        <w:rPr>
-          <w:color w:val="1a1c1e"/>
-          <w:sz w:val="24"/>
-          <w:szCs w:val="24"/>
-        </w:rPr>
-      </w:pPr>
-      <w:r>
-        <w:rPr>
-          <w:rtl w:val="0"/>
-        </w:rPr>
       </w:r>
     </w:p>
     <w:tbl>
@@ -746,6 +666,7 @@
       <w:tr>
         <w:trPr>
           <w:cantSplit w:val="0"/>
+          <w:trHeight w:val="754.921875" w:hRule="atLeast"/>
           <w:tblHeader w:val="0"/>
         </w:trPr>
         <w:tc>
@@ -757,7 +678,7 @@
               <w:bottom w:w="100.0" w:type="dxa"/>
               <w:right w:w="100.0" w:type="dxa"/>
             </w:tcMar>
-            <w:vAlign w:val="top"/>
+            <w:vAlign w:val="center"/>
           </w:tcPr>
           <w:p>
             <w:pPr>
@@ -786,10 +707,28 @@
             </w:pPr>
             <w:r>
               <w:rPr>
-                <w:rtl w:val="0"/>
-              </w:rPr>
-            </w:r>
-          </w:p>
+                <w:b w:val="1"/>
+                <w:bCs w:val="1"/>
+                <w:color w:val="1a1c1e"/>
+                <w:sz w:val="20"/>
+                <w:szCs w:val="20"/>
+                <w:rtl w:val="0"/>
+              </w:rPr>
+              <w:t xml:space="preserve">N°</w:t>
+            </w:r>
+          </w:p>
+        </w:tc>
+        <w:tc>
+          <w:tcPr>
+            <w:shd w:fill="auto" w:val="clear"/>
+            <w:tcMar>
+              <w:top w:w="100.0" w:type="dxa"/>
+              <w:left w:w="100.0" w:type="dxa"/>
+              <w:bottom w:w="100.0" w:type="dxa"/>
+              <w:right w:w="100.0" w:type="dxa"/>
+            </w:tcMar>
+            <w:vAlign w:val="center"/>
+          </w:tcPr>
           <w:p>
             <w:pPr>
               <w:keepNext w:val="0"/>
@@ -824,7 +763,7 @@
                 <w:szCs w:val="20"/>
                 <w:rtl w:val="0"/>
               </w:rPr>
-              <w:t xml:space="preserve">N°</w:t>
+              <w:t xml:space="preserve">EMPRESA OFERENTE</w:t>
             </w:r>
           </w:p>
         </w:tc>
@@ -837,7 +776,44 @@
               <w:bottom w:w="100.0" w:type="dxa"/>
               <w:right w:w="100.0" w:type="dxa"/>
             </w:tcMar>
-            <w:vAlign w:val="top"/>
+            <w:vAlign w:val="center"/>
+          </w:tcPr>
+          <w:p>
+            <w:pPr>
+              <w:widowControl w:val="0"/>
+              <w:spacing w:line="240" w:lineRule="auto"/>
+              <w:jc w:val="center"/>
+              <w:rPr>
+                <w:b w:val="1"/>
+                <w:bCs w:val="1"/>
+                <w:color w:val="1a1c1e"/>
+                <w:sz w:val="20"/>
+                <w:szCs w:val="20"/>
+              </w:rPr>
+            </w:pPr>
+            <w:r>
+              <w:rPr>
+                <w:b w:val="1"/>
+                <w:bCs w:val="1"/>
+                <w:color w:val="1a1c1e"/>
+                <w:sz w:val="20"/>
+                <w:szCs w:val="20"/>
+                <w:rtl w:val="0"/>
+              </w:rPr>
+              <w:t xml:space="preserve">RIF</w:t>
+            </w:r>
+          </w:p>
+        </w:tc>
+        <w:tc>
+          <w:tcPr>
+            <w:shd w:fill="auto" w:val="clear"/>
+            <w:tcMar>
+              <w:top w:w="100.0" w:type="dxa"/>
+              <w:left w:w="100.0" w:type="dxa"/>
+              <w:bottom w:w="100.0" w:type="dxa"/>
+              <w:right w:w="100.0" w:type="dxa"/>
+            </w:tcMar>
+            <w:vAlign w:val="center"/>
           </w:tcPr>
           <w:p>
             <w:pPr>
@@ -866,10 +842,65 @@
             </w:pPr>
             <w:r>
               <w:rPr>
-                <w:rtl w:val="0"/>
-              </w:rPr>
-            </w:r>
-          </w:p>
+                <w:b w:val="1"/>
+                <w:bCs w:val="1"/>
+                <w:color w:val="1a1c1e"/>
+                <w:sz w:val="20"/>
+                <w:szCs w:val="20"/>
+                <w:rtl w:val="0"/>
+              </w:rPr>
+              <w:t xml:space="preserve">REPRESENTANTE LEGAL</w:t>
+            </w:r>
+          </w:p>
+        </w:tc>
+        <w:tc>
+          <w:tcPr>
+            <w:shd w:fill="auto" w:val="clear"/>
+            <w:tcMar>
+              <w:top w:w="100.0" w:type="dxa"/>
+              <w:left w:w="100.0" w:type="dxa"/>
+              <w:bottom w:w="100.0" w:type="dxa"/>
+              <w:right w:w="100.0" w:type="dxa"/>
+            </w:tcMar>
+            <w:vAlign w:val="center"/>
+          </w:tcPr>
+          <w:p>
+            <w:pPr>
+              <w:widowControl w:val="0"/>
+              <w:spacing w:line="240" w:lineRule="auto"/>
+              <w:jc w:val="center"/>
+              <w:rPr>
+                <w:b w:val="1"/>
+                <w:bCs w:val="1"/>
+                <w:color w:val="1a1c1e"/>
+                <w:sz w:val="20"/>
+                <w:szCs w:val="20"/>
+              </w:rPr>
+            </w:pPr>
+            <w:r>
+              <w:rPr>
+                <w:b w:val="1"/>
+                <w:bCs w:val="1"/>
+                <w:color w:val="1a1c1e"/>
+                <w:sz w:val="20"/>
+                <w:szCs w:val="20"/>
+                <w:rtl w:val="0"/>
+              </w:rPr>
+              <w:t xml:space="preserve">C.I.</w:t>
+            </w:r>
+          </w:p>
+        </w:tc>
+        <w:tc>
+          <w:tcPr>
+            <w:shd w:fill="auto" w:val="clear"/>
+            <w:tcMar>
+              <w:top w:w="100.0" w:type="dxa"/>
+              <w:left w:w="100.0" w:type="dxa"/>
+              <w:bottom w:w="100.0" w:type="dxa"/>
+              <w:right w:w="100.0" w:type="dxa"/>
+            </w:tcMar>
+            <w:vAlign w:val="center"/>
+          </w:tcPr>
           <w:p>
             <w:pPr>
               <w:keepNext w:val="0"/>
@@ -904,7 +935,7 @@
                 <w:szCs w:val="20"/>
                 <w:rtl w:val="0"/>
               </w:rPr>
-              <w:t xml:space="preserve">EMPRESA OFERENTE</w:t>
+              <w:t xml:space="preserve">MONTO DE LA OFERTA (Bs.)</w:t>
             </w:r>
           </w:p>
         </w:tc>
@@ -917,44 +948,7 @@
               <w:bottom w:w="100.0" w:type="dxa"/>
               <w:right w:w="100.0" w:type="dxa"/>
             </w:tcMar>
-            <w:vAlign w:val="top"/>
-          </w:tcPr>
-          <w:p>
-            <w:pPr>
-              <w:widowControl w:val="0"/>
-              <w:spacing w:line="240" w:lineRule="auto"/>
-              <w:jc w:val="center"/>
-              <w:rPr>
-                <w:b w:val="1"/>
-                <w:bCs w:val="1"/>
-                <w:color w:val="1a1c1e"/>
-                <w:sz w:val="20"/>
-                <w:szCs w:val="20"/>
-              </w:rPr>
-            </w:pPr>
-            <w:r>
-              <w:rPr>
-                <w:b w:val="1"/>
-                <w:bCs w:val="1"/>
-                <w:color w:val="1a1c1e"/>
-                <w:sz w:val="20"/>
-                <w:szCs w:val="20"/>
-                <w:rtl w:val="0"/>
-              </w:rPr>
-              <w:t xml:space="preserve">RIF</w:t>
-            </w:r>
-          </w:p>
-        </w:tc>
-        <w:tc>
-          <w:tcPr>
-            <w:shd w:fill="auto" w:val="clear"/>
-            <w:tcMar>
-              <w:top w:w="100.0" w:type="dxa"/>
-              <w:left w:w="100.0" w:type="dxa"/>
-              <w:bottom w:w="100.0" w:type="dxa"/>
-              <w:right w:w="100.0" w:type="dxa"/>
-            </w:tcMar>
-            <w:vAlign w:val="top"/>
+            <w:vAlign w:val="center"/>
           </w:tcPr>
           <w:p>
             <w:pPr>
@@ -983,10 +977,66 @@
             </w:pPr>
             <w:r>
               <w:rPr>
-                <w:rtl w:val="0"/>
-              </w:rPr>
-            </w:r>
-          </w:p>
+                <w:b w:val="1"/>
+                <w:bCs w:val="1"/>
+                <w:color w:val="1a1c1e"/>
+                <w:sz w:val="20"/>
+                <w:szCs w:val="20"/>
+                <w:rtl w:val="0"/>
+              </w:rPr>
+              <w:t xml:space="preserve">OBSERVACIONES PRELIMINARES</w:t>
+            </w:r>
+          </w:p>
+        </w:tc>
+      </w:tr>
+      <w:tr>
+        <w:trPr>
+          <w:cantSplit w:val="0"/>
+          <w:trHeight w:val="737.0078740157481" w:hRule="atLeast"/>
+          <w:tblHeader w:val="0"/>
+        </w:trPr>
+        <w:tc>
+          <w:tcPr>
+            <w:shd w:fill="auto" w:val="clear"/>
+            <w:tcMar>
+              <w:top w:w="100.0" w:type="dxa"/>
+              <w:left w:w="100.0" w:type="dxa"/>
+              <w:bottom w:w="100.0" w:type="dxa"/>
+              <w:right w:w="100.0" w:type="dxa"/>
+            </w:tcMar>
+            <w:vAlign w:val="top"/>
+          </w:tcPr>
+          <w:p>
+            <w:pPr>
+              <w:ind w:left="-105" w:right="-120" w:firstLine="0"/>
+              <w:jc w:val="center"/>
+              <w:rPr>
+                <w:b w:val="1"/>
+                <w:bCs w:val="1"/>
+                <w:color w:val="1a1c1e"/>
+                <w:sz w:val="20"/>
+                <w:szCs w:val="20"/>
+                <w:highlight w:val="white"/>
+              </w:rPr>
+            </w:pPr>
+            <w:r>
+              <w:rPr>
+                <w:rtl w:val="0"/>
+              </w:rPr>
+            </w:r>
+          </w:p>
+        </w:tc>
+        <w:tc>
+          <w:tcPr>
+            <w:shd w:fill="auto" w:val="clear"/>
+            <w:tcMar>
+              <w:top w:w="100.0" w:type="dxa"/>
+              <w:left w:w="100.0" w:type="dxa"/>
+              <w:bottom w:w="100.0" w:type="dxa"/>
+              <w:right w:w="100.0" w:type="dxa"/>
+            </w:tcMar>
+            <w:vAlign w:val="top"/>
+          </w:tcPr>
           <w:p>
             <w:pPr>
               <w:keepNext w:val="0"/>
@@ -1014,16 +1064,22 @@
             </w:pPr>
             <w:r>
               <w:rPr>
-                <w:b w:val="1"/>
-                <w:bCs w:val="1"/>
-                <w:color w:val="1a1c1e"/>
-                <w:sz w:val="20"/>
-                <w:szCs w:val="20"/>
-                <w:rtl w:val="0"/>
-              </w:rPr>
-              <w:t xml:space="preserve">REPRESENTANTE LEGAL </w:t>
-            </w:r>
-          </w:p>
+                <w:rtl w:val="0"/>
+              </w:rPr>
+            </w:r>
+          </w:p>
+        </w:tc>
+        <w:tc>
+          <w:tcPr>
+            <w:shd w:fill="auto" w:val="clear"/>
+            <w:tcMar>
+              <w:top w:w="100.0" w:type="dxa"/>
+              <w:left w:w="100.0" w:type="dxa"/>
+              <w:bottom w:w="100.0" w:type="dxa"/>
+              <w:right w:w="100.0" w:type="dxa"/>
+            </w:tcMar>
+            <w:vAlign w:val="top"/>
+          </w:tcPr>
           <w:p>
             <w:pPr>
               <w:keepNext w:val="0"/>
@@ -1047,49 +1103,13 @@
                 <w:color w:val="1a1c1e"/>
                 <w:sz w:val="20"/>
                 <w:szCs w:val="20"/>
-              </w:rPr>
-            </w:pPr>
-            <w:r>
-              <w:rPr>
-                <w:rtl w:val="0"/>
-              </w:rPr>
-            </w:r>
-          </w:p>
-        </w:tc>
-        <w:tc>
-          <w:tcPr>
-            <w:shd w:fill="auto" w:val="clear"/>
-            <w:tcMar>
-              <w:top w:w="100.0" w:type="dxa"/>
-              <w:left w:w="100.0" w:type="dxa"/>
-              <w:bottom w:w="100.0" w:type="dxa"/>
-              <w:right w:w="100.0" w:type="dxa"/>
-            </w:tcMar>
-            <w:vAlign w:val="top"/>
-          </w:tcPr>
-          <w:p>
-            <w:pPr>
-              <w:widowControl w:val="0"/>
-              <w:spacing w:line="240" w:lineRule="auto"/>
-              <w:jc w:val="center"/>
-              <w:rPr>
-                <w:b w:val="1"/>
-                <w:bCs w:val="1"/>
-                <w:color w:val="1a1c1e"/>
-                <w:sz w:val="20"/>
-                <w:szCs w:val="20"/>
-              </w:rPr>
-            </w:pPr>
-            <w:r>
-              <w:rPr>
-                <w:b w:val="1"/>
-                <w:bCs w:val="1"/>
-                <w:color w:val="1a1c1e"/>
-                <w:sz w:val="20"/>
-                <w:szCs w:val="20"/>
-                <w:rtl w:val="0"/>
-              </w:rPr>
-              <w:t xml:space="preserve">C.I.</w:t>
+                <w:highlight w:val="white"/>
+              </w:rPr>
+            </w:pPr>
+            <w:r>
+              <w:rPr>
+                <w:rtl w:val="0"/>
+              </w:rPr>
             </w:r>
           </w:p>
         </w:tc>
@@ -1135,6 +1155,18 @@
               </w:rPr>
             </w:r>
           </w:p>
+        </w:tc>
+        <w:tc>
+          <w:tcPr>
+            <w:shd w:fill="auto" w:val="clear"/>
+            <w:tcMar>
+              <w:top w:w="100.0" w:type="dxa"/>
+              <w:left w:w="100.0" w:type="dxa"/>
+              <w:bottom w:w="100.0" w:type="dxa"/>
+              <w:right w:w="100.0" w:type="dxa"/>
+            </w:tcMar>
+            <w:vAlign w:val="top"/>
+          </w:tcPr>
           <w:p>
             <w:pPr>
               <w:keepNext w:val="0"/>
@@ -1158,20 +1190,57 @@
                 <w:color w:val="1a1c1e"/>
                 <w:sz w:val="20"/>
                 <w:szCs w:val="20"/>
-              </w:rPr>
-            </w:pPr>
-            <w:r>
-              <w:rPr>
-                <w:b w:val="1"/>
-                <w:bCs w:val="1"/>
-                <w:color w:val="1a1c1e"/>
-                <w:sz w:val="20"/>
-                <w:szCs w:val="20"/>
-                <w:rtl w:val="0"/>
-              </w:rPr>
-              <w:t xml:space="preserve">MONTO DE LA OFERTA (Bs.)</w:t>
-            </w:r>
-          </w:p>
+                <w:highlight w:val="white"/>
+              </w:rPr>
+            </w:pPr>
+            <w:r>
+              <w:rPr>
+                <w:rtl w:val="0"/>
+              </w:rPr>
+            </w:r>
+          </w:p>
+        </w:tc>
+        <w:tc>
+          <w:tcPr>
+            <w:shd w:fill="auto" w:val="clear"/>
+            <w:tcMar>
+              <w:top w:w="100.0" w:type="dxa"/>
+              <w:left w:w="100.0" w:type="dxa"/>
+              <w:bottom w:w="100.0" w:type="dxa"/>
+              <w:right w:w="100.0" w:type="dxa"/>
+            </w:tcMar>
+            <w:vAlign w:val="top"/>
+          </w:tcPr>
+          <w:p>
+            <w:pPr>
+              <w:ind w:left="-141.7322834645671" w:right="-82.32283464566933" w:firstLine="0"/>
+              <w:jc w:val="center"/>
+              <w:rPr>
+                <w:b w:val="1"/>
+                <w:bCs w:val="1"/>
+                <w:color w:val="1a1c1e"/>
+                <w:sz w:val="20"/>
+                <w:szCs w:val="20"/>
+              </w:rPr>
+            </w:pPr>
+            <w:r>
+              <w:rPr>
+                <w:rtl w:val="0"/>
+              </w:rPr>
+            </w:r>
+          </w:p>
+        </w:tc>
+        <w:tc>
+          <w:tcPr>
+            <w:shd w:fill="auto" w:val="clear"/>
+            <w:tcMar>
+              <w:top w:w="100.0" w:type="dxa"/>
+              <w:left w:w="100.0" w:type="dxa"/>
+              <w:bottom w:w="100.0" w:type="dxa"/>
+              <w:right w:w="100.0" w:type="dxa"/>
+            </w:tcMar>
+            <w:vAlign w:val="top"/>
+          </w:tcPr>
           <w:p>
             <w:pPr>
               <w:keepNext w:val="0"/>
@@ -1204,6 +1273,44 @@
             </w:r>
           </w:p>
         </w:tc>
+      </w:tr>
+      <w:tr>
+        <w:trPr>
+          <w:cantSplit w:val="0"/>
+          <w:trHeight w:val="737.0078740157481" w:hRule="atLeast"/>
+          <w:tblHeader w:val="0"/>
+        </w:trPr>
+        <w:tc>
+          <w:tcPr>
+            <w:shd w:fill="auto" w:val="clear"/>
+            <w:tcMar>
+              <w:top w:w="100.0" w:type="dxa"/>
+              <w:left w:w="100.0" w:type="dxa"/>
+              <w:bottom w:w="100.0" w:type="dxa"/>
+              <w:right w:w="100.0" w:type="dxa"/>
+            </w:tcMar>
+            <w:vAlign w:val="top"/>
+          </w:tcPr>
+          <w:p>
+            <w:pPr>
+              <w:ind w:left="-105" w:right="-120" w:firstLine="0"/>
+              <w:jc w:val="center"/>
+              <w:rPr>
+                <w:b w:val="1"/>
+                <w:bCs w:val="1"/>
+                <w:color w:val="1a1c1e"/>
+                <w:sz w:val="20"/>
+                <w:szCs w:val="20"/>
+                <w:highlight w:val="white"/>
+              </w:rPr>
+            </w:pPr>
+            <w:r>
+              <w:rPr>
+                <w:rtl w:val="0"/>
+              </w:rPr>
+            </w:r>
+          </w:p>
+        </w:tc>
         <w:tc>
           <w:tcPr>
             <w:shd w:fill="auto" w:val="clear"/>
@@ -1246,6 +1353,18 @@
               </w:rPr>
             </w:r>
           </w:p>
+        </w:tc>
+        <w:tc>
+          <w:tcPr>
+            <w:shd w:fill="auto" w:val="clear"/>
+            <w:tcMar>
+              <w:top w:w="100.0" w:type="dxa"/>
+              <w:left w:w="100.0" w:type="dxa"/>
+              <w:bottom w:w="100.0" w:type="dxa"/>
+              <w:right w:w="100.0" w:type="dxa"/>
+            </w:tcMar>
+            <w:vAlign w:val="top"/>
+          </w:tcPr>
           <w:p>
             <w:pPr>
               <w:keepNext w:val="0"/>
@@ -1269,112 +1388,13 @@
                 <w:color w:val="1a1c1e"/>
                 <w:sz w:val="20"/>
                 <w:szCs w:val="20"/>
-              </w:rPr>
-            </w:pPr>
-            <w:r>
-              <w:rPr>
-                <w:b w:val="1"/>
-                <w:bCs w:val="1"/>
-                <w:color w:val="1a1c1e"/>
-                <w:sz w:val="20"/>
-                <w:szCs w:val="20"/>
-                <w:rtl w:val="0"/>
-              </w:rPr>
-              <w:t xml:space="preserve">OBSERVACIONES PRELIMINARES</w:t>
-            </w:r>
-          </w:p>
-        </w:tc>
-      </w:tr>
-      <w:tr>
-        <w:trPr>
-          <w:cantSplit w:val="0"/>
-          <w:tblHeader w:val="0"/>
-        </w:trPr>
-        <w:tc>
-          <w:tcPr>
-            <w:shd w:fill="auto" w:val="clear"/>
-            <w:tcMar>
-              <w:top w:w="100.0" w:type="dxa"/>
-              <w:left w:w="100.0" w:type="dxa"/>
-              <w:bottom w:w="100.0" w:type="dxa"/>
-              <w:right w:w="100.0" w:type="dxa"/>
-            </w:tcMar>
-            <w:vAlign w:val="top"/>
-          </w:tcPr>
-          <w:p>
-            <w:pPr>
-              <w:ind w:left="-135" w:right="-120" w:firstLine="0"/>
-              <w:jc w:val="center"/>
-              <w:rPr>
-                <w:b w:val="1"/>
-                <w:bCs w:val="1"/>
-                <w:color w:val="1a1c1e"/>
-                <w:sz w:val="20"/>
-                <w:szCs w:val="20"/>
                 <w:highlight w:val="white"/>
               </w:rPr>
             </w:pPr>
             <w:r>
               <w:rPr>
-                <w:b w:val="1"/>
-                <w:bCs w:val="1"/>
-                <w:color w:val="1a1c1e"/>
-                <w:sz w:val="20"/>
-                <w:szCs w:val="20"/>
-                <w:highlight w:val="white"/>
-                <w:rtl w:val="0"/>
-              </w:rPr>
-              <w:t xml:space="preserve">{#</w:t>
-            </w:r>
-            <w:r>
-              <w:rPr>
-                <w:b w:val="1"/>
-                <w:bCs w:val="1"/>
-                <w:color w:val="1a1c1e"/>
-                <w:sz w:val="20"/>
-                <w:szCs w:val="20"/>
-                <w:highlight w:val="yellow"/>
-                <w:rtl w:val="0"/>
-              </w:rPr>
-              <w:t xml:space="preserve">adquirientes</w:t>
-            </w:r>
-            <w:r>
-              <w:rPr>
-                <w:b w:val="1"/>
-                <w:bCs w:val="1"/>
-                <w:color w:val="1a1c1e"/>
-                <w:sz w:val="20"/>
-                <w:szCs w:val="20"/>
-                <w:highlight w:val="white"/>
-                <w:rtl w:val="0"/>
-              </w:rPr>
-              <w:t xml:space="preserve">}</w:t>
-            </w:r>
-          </w:p>
-          <w:p>
-            <w:pPr>
-              <w:ind w:left="-105" w:right="-120" w:firstLine="0"/>
-              <w:jc w:val="center"/>
-              <w:rPr>
-                <w:b w:val="1"/>
-                <w:bCs w:val="1"/>
-                <w:color w:val="1a1c1e"/>
-                <w:sz w:val="20"/>
-                <w:szCs w:val="20"/>
-                <w:highlight w:val="white"/>
-              </w:rPr>
-            </w:pPr>
-            <w:r>
-              <w:rPr>
-                <w:b w:val="1"/>
-                <w:bCs w:val="1"/>
-                <w:color w:val="1a1c1e"/>
-                <w:sz w:val="20"/>
-                <w:szCs w:val="20"/>
-                <w:highlight w:val="white"/>
-                <w:rtl w:val="0"/>
-              </w:rPr>
-              <w:t xml:space="preserve">{numero}</w:t>
+                <w:rtl w:val="0"/>
+              </w:rPr>
             </w:r>
           </w:p>
         </w:tc>
@@ -1416,14 +1436,8 @@
             </w:pPr>
             <w:r>
               <w:rPr>
-                <w:b w:val="1"/>
-                <w:bCs w:val="1"/>
-                <w:color w:val="1a1c1e"/>
-                <w:sz w:val="20"/>
-                <w:szCs w:val="20"/>
-                <w:rtl w:val="0"/>
-              </w:rPr>
-              <w:t xml:space="preserve">{nombre_proveedor_oferente_au_au}</w:t>
+                <w:rtl w:val="0"/>
+              </w:rPr>
             </w:r>
           </w:p>
         </w:tc>
@@ -1466,15 +1480,38 @@
             </w:pPr>
             <w:r>
               <w:rPr>
-                <w:b w:val="1"/>
-                <w:bCs w:val="1"/>
-                <w:color w:val="1a1c1e"/>
-                <w:sz w:val="20"/>
-                <w:szCs w:val="20"/>
-                <w:highlight w:val="white"/>
-                <w:rtl w:val="0"/>
-              </w:rPr>
-              <w:t xml:space="preserve">{rif_proveedor_oferente_au_au}</w:t>
+                <w:rtl w:val="0"/>
+              </w:rPr>
+            </w:r>
+          </w:p>
+        </w:tc>
+        <w:tc>
+          <w:tcPr>
+            <w:shd w:fill="auto" w:val="clear"/>
+            <w:tcMar>
+              <w:top w:w="100.0" w:type="dxa"/>
+              <w:left w:w="100.0" w:type="dxa"/>
+              <w:bottom w:w="100.0" w:type="dxa"/>
+              <w:right w:w="100.0" w:type="dxa"/>
+            </w:tcMar>
+            <w:vAlign w:val="top"/>
+          </w:tcPr>
+          <w:p>
+            <w:pPr>
+              <w:ind w:left="-141.7322834645671" w:right="-82.32283464566933" w:firstLine="0"/>
+              <w:jc w:val="center"/>
+              <w:rPr>
+                <w:b w:val="1"/>
+                <w:bCs w:val="1"/>
+                <w:color w:val="1a1c1e"/>
+                <w:sz w:val="20"/>
+                <w:szCs w:val="20"/>
+              </w:rPr>
+            </w:pPr>
+            <w:r>
+              <w:rPr>
+                <w:rtl w:val="0"/>
+              </w:rPr>
             </w:r>
           </w:p>
         </w:tc>
@@ -1516,14 +1553,46 @@
             </w:pPr>
             <w:r>
               <w:rPr>
-                <w:b w:val="1"/>
-                <w:bCs w:val="1"/>
-                <w:color w:val="1a1c1e"/>
-                <w:sz w:val="20"/>
-                <w:szCs w:val="20"/>
-                <w:rtl w:val="0"/>
-              </w:rPr>
-              <w:t xml:space="preserve">{nombre_rep_legal_oferente_au_au}</w:t>
+                <w:rtl w:val="0"/>
+              </w:rPr>
+            </w:r>
+          </w:p>
+        </w:tc>
+      </w:tr>
+      <w:tr>
+        <w:trPr>
+          <w:cantSplit w:val="0"/>
+          <w:trHeight w:val="737.0078740157481" w:hRule="atLeast"/>
+          <w:tblHeader w:val="0"/>
+        </w:trPr>
+        <w:tc>
+          <w:tcPr>
+            <w:shd w:fill="auto" w:val="clear"/>
+            <w:tcMar>
+              <w:top w:w="100.0" w:type="dxa"/>
+              <w:left w:w="100.0" w:type="dxa"/>
+              <w:bottom w:w="100.0" w:type="dxa"/>
+              <w:right w:w="100.0" w:type="dxa"/>
+            </w:tcMar>
+            <w:vAlign w:val="top"/>
+          </w:tcPr>
+          <w:p>
+            <w:pPr>
+              <w:ind w:left="-105" w:right="-120" w:firstLine="0"/>
+              <w:jc w:val="center"/>
+              <w:rPr>
+                <w:b w:val="1"/>
+                <w:bCs w:val="1"/>
+                <w:color w:val="1a1c1e"/>
+                <w:sz w:val="20"/>
+                <w:szCs w:val="20"/>
+                <w:highlight w:val="white"/>
+              </w:rPr>
+            </w:pPr>
+            <w:r>
+              <w:rPr>
+                <w:rtl w:val="0"/>
+              </w:rPr>
             </w:r>
           </w:p>
         </w:tc>
@@ -1561,20 +1630,12 @@
                 <w:color w:val="1a1c1e"/>
                 <w:sz w:val="20"/>
                 <w:szCs w:val="20"/>
-                <w:highlight w:val="white"/>
-              </w:rPr>
-            </w:pPr>
-            <w:r>
-              <w:rPr>
-                <w:b w:val="1"/>
-                <w:bCs w:val="1"/>
-                <w:color w:val="1a1c1e"/>
-                <w:sz w:val="20"/>
-                <w:szCs w:val="20"/>
-                <w:highlight w:val="white"/>
-                <w:rtl w:val="0"/>
-              </w:rPr>
-              <w:t xml:space="preserve">{cedula_rep_legal_oferente_au_au}</w:t>
+              </w:rPr>
+            </w:pPr>
+            <w:r>
+              <w:rPr>
+                <w:rtl w:val="0"/>
+              </w:rPr>
             </w:r>
           </w:p>
         </w:tc>
@@ -1612,20 +1673,114 @@
                 <w:color w:val="1a1c1e"/>
                 <w:sz w:val="20"/>
                 <w:szCs w:val="20"/>
-              </w:rPr>
-            </w:pPr>
-            <w:r>
-              <w:rPr>
-                <w:b w:val="1"/>
-                <w:bCs w:val="1"/>
-                <w:color w:val="1a1c1e"/>
-                <w:sz w:val="20"/>
-                <w:szCs w:val="20"/>
-                <w:rtl w:val="0"/>
-              </w:rPr>
-              <w:t xml:space="preserve">{datos_registro_mercantil_proveedor_oferente_au_au} </w:t>
-            </w:r>
-          </w:p>
+                <w:highlight w:val="white"/>
+              </w:rPr>
+            </w:pPr>
+            <w:r>
+              <w:rPr>
+                <w:rtl w:val="0"/>
+              </w:rPr>
+            </w:r>
+          </w:p>
+        </w:tc>
+        <w:tc>
+          <w:tcPr>
+            <w:shd w:fill="auto" w:val="clear"/>
+            <w:tcMar>
+              <w:top w:w="100.0" w:type="dxa"/>
+              <w:left w:w="100.0" w:type="dxa"/>
+              <w:bottom w:w="100.0" w:type="dxa"/>
+              <w:right w:w="100.0" w:type="dxa"/>
+            </w:tcMar>
+            <w:vAlign w:val="top"/>
+          </w:tcPr>
+          <w:p>
+            <w:pPr>
+              <w:keepNext w:val="0"/>
+              <w:keepLines w:val="0"/>
+              <w:pageBreakBefore w:val="0"/>
+              <w:widowControl w:val="0"/>
+              <w:pBdr>
+                <w:top w:space="0" w:sz="0" w:val="nil"/>
+                <w:left w:space="0" w:sz="0" w:val="nil"/>
+                <w:bottom w:space="0" w:sz="0" w:val="nil"/>
+                <w:right w:space="0" w:sz="0" w:val="nil"/>
+                <w:between w:space="0" w:sz="0" w:val="nil"/>
+              </w:pBdr>
+              <w:shd w:fill="auto" w:val="clear"/>
+              <w:spacing w:after="0" w:before="0" w:line="240" w:lineRule="auto"/>
+              <w:ind w:left="0" w:right="0" w:firstLine="0"/>
+              <w:jc w:val="center"/>
+              <w:rPr>
+                <w:b w:val="1"/>
+                <w:bCs w:val="1"/>
+                <w:color w:val="1a1c1e"/>
+                <w:sz w:val="20"/>
+                <w:szCs w:val="20"/>
+              </w:rPr>
+            </w:pPr>
+            <w:r>
+              <w:rPr>
+                <w:rtl w:val="0"/>
+              </w:rPr>
+            </w:r>
+          </w:p>
+        </w:tc>
+        <w:tc>
+          <w:tcPr>
+            <w:shd w:fill="auto" w:val="clear"/>
+            <w:tcMar>
+              <w:top w:w="100.0" w:type="dxa"/>
+              <w:left w:w="100.0" w:type="dxa"/>
+              <w:bottom w:w="100.0" w:type="dxa"/>
+              <w:right w:w="100.0" w:type="dxa"/>
+            </w:tcMar>
+            <w:vAlign w:val="top"/>
+          </w:tcPr>
+          <w:p>
+            <w:pPr>
+              <w:keepNext w:val="0"/>
+              <w:keepLines w:val="0"/>
+              <w:pageBreakBefore w:val="0"/>
+              <w:widowControl w:val="0"/>
+              <w:pBdr>
+                <w:top w:space="0" w:sz="0" w:val="nil"/>
+                <w:left w:space="0" w:sz="0" w:val="nil"/>
+                <w:bottom w:space="0" w:sz="0" w:val="nil"/>
+                <w:right w:space="0" w:sz="0" w:val="nil"/>
+                <w:between w:space="0" w:sz="0" w:val="nil"/>
+              </w:pBdr>
+              <w:shd w:fill="auto" w:val="clear"/>
+              <w:spacing w:after="0" w:before="0" w:line="240" w:lineRule="auto"/>
+              <w:ind w:left="0" w:right="0" w:firstLine="0"/>
+              <w:jc w:val="center"/>
+              <w:rPr>
+                <w:b w:val="1"/>
+                <w:bCs w:val="1"/>
+                <w:color w:val="1a1c1e"/>
+                <w:sz w:val="20"/>
+                <w:szCs w:val="20"/>
+                <w:highlight w:val="white"/>
+              </w:rPr>
+            </w:pPr>
+            <w:r>
+              <w:rPr>
+                <w:rtl w:val="0"/>
+              </w:rPr>
+            </w:r>
+          </w:p>
+        </w:tc>
+        <w:tc>
+          <w:tcPr>
+            <w:shd w:fill="auto" w:val="clear"/>
+            <w:tcMar>
+              <w:top w:w="100.0" w:type="dxa"/>
+              <w:left w:w="100.0" w:type="dxa"/>
+              <w:bottom w:w="100.0" w:type="dxa"/>
+              <w:right w:w="100.0" w:type="dxa"/>
+            </w:tcMar>
+            <w:vAlign w:val="top"/>
+          </w:tcPr>
           <w:p>
             <w:pPr>
               <w:ind w:left="-141.7322834645671" w:right="-82.32283464566933" w:firstLine="0"/>
@@ -1640,29 +1795,163 @@
             </w:pPr>
             <w:r>
               <w:rPr>
+                <w:rtl w:val="0"/>
+              </w:rPr>
+            </w:r>
+          </w:p>
+        </w:tc>
+        <w:tc>
+          <w:tcPr>
+            <w:shd w:fill="auto" w:val="clear"/>
+            <w:tcMar>
+              <w:top w:w="100.0" w:type="dxa"/>
+              <w:left w:w="100.0" w:type="dxa"/>
+              <w:bottom w:w="100.0" w:type="dxa"/>
+              <w:right w:w="100.0" w:type="dxa"/>
+            </w:tcMar>
+            <w:vAlign w:val="top"/>
+          </w:tcPr>
+          <w:p>
+            <w:pPr>
+              <w:keepNext w:val="0"/>
+              <w:keepLines w:val="0"/>
+              <w:pageBreakBefore w:val="0"/>
+              <w:widowControl w:val="0"/>
+              <w:pBdr>
+                <w:top w:space="0" w:sz="0" w:val="nil"/>
+                <w:left w:space="0" w:sz="0" w:val="nil"/>
+                <w:bottom w:space="0" w:sz="0" w:val="nil"/>
+                <w:right w:space="0" w:sz="0" w:val="nil"/>
+                <w:between w:space="0" w:sz="0" w:val="nil"/>
+              </w:pBdr>
+              <w:shd w:fill="auto" w:val="clear"/>
+              <w:spacing w:after="0" w:before="0" w:line="240" w:lineRule="auto"/>
+              <w:ind w:left="0" w:right="0" w:firstLine="0"/>
+              <w:jc w:val="center"/>
+              <w:rPr>
+                <w:b w:val="1"/>
+                <w:bCs w:val="1"/>
+                <w:color w:val="1a1c1e"/>
+                <w:sz w:val="20"/>
+                <w:szCs w:val="20"/>
+              </w:rPr>
+            </w:pPr>
+            <w:r>
+              <w:rPr>
+                <w:rtl w:val="0"/>
+              </w:rPr>
+            </w:r>
+          </w:p>
+        </w:tc>
+      </w:tr>
+      <w:tr>
+        <w:trPr>
+          <w:cantSplit w:val="0"/>
+          <w:trHeight w:val="737.0078740157481" w:hRule="atLeast"/>
+          <w:tblHeader w:val="0"/>
+        </w:trPr>
+        <w:tc>
+          <w:tcPr>
+            <w:shd w:fill="auto" w:val="clear"/>
+            <w:tcMar>
+              <w:top w:w="100.0" w:type="dxa"/>
+              <w:left w:w="100.0" w:type="dxa"/>
+              <w:bottom w:w="100.0" w:type="dxa"/>
+              <w:right w:w="100.0" w:type="dxa"/>
+            </w:tcMar>
+            <w:vAlign w:val="top"/>
+          </w:tcPr>
+          <w:p>
+            <w:pPr>
+              <w:ind w:left="-105" w:right="-120" w:firstLine="0"/>
+              <w:jc w:val="center"/>
+              <w:rPr>
                 <w:b w:val="1"/>
                 <w:bCs w:val="1"/>
                 <w:color w:val="1a1c1e"/>
                 <w:sz w:val="20"/>
                 <w:szCs w:val="20"/>
                 <w:highlight w:val="white"/>
-                <w:rtl w:val="0"/>
-              </w:rPr>
-              <w:t xml:space="preserve">{/</w:t>
-            </w:r>
-            <w:r>
-              <w:rPr>
-                <w:b w:val="1"/>
-                <w:bCs w:val="1"/>
-                <w:color w:val="1a1c1e"/>
-                <w:sz w:val="20"/>
-                <w:szCs w:val="20"/>
-                <w:highlight w:val="yellow"/>
-                <w:rtl w:val="0"/>
-              </w:rPr>
-              <w:t xml:space="preserve">adquirientes</w:t>
-            </w:r>
-            <w:r>
+              </w:rPr>
+            </w:pPr>
+            <w:r>
+              <w:rPr>
+                <w:rtl w:val="0"/>
+              </w:rPr>
+            </w:r>
+          </w:p>
+        </w:tc>
+        <w:tc>
+          <w:tcPr>
+            <w:shd w:fill="auto" w:val="clear"/>
+            <w:tcMar>
+              <w:top w:w="100.0" w:type="dxa"/>
+              <w:left w:w="100.0" w:type="dxa"/>
+              <w:bottom w:w="100.0" w:type="dxa"/>
+              <w:right w:w="100.0" w:type="dxa"/>
+            </w:tcMar>
+            <w:vAlign w:val="top"/>
+          </w:tcPr>
+          <w:p>
+            <w:pPr>
+              <w:keepNext w:val="0"/>
+              <w:keepLines w:val="0"/>
+              <w:pageBreakBefore w:val="0"/>
+              <w:widowControl w:val="0"/>
+              <w:pBdr>
+                <w:top w:space="0" w:sz="0" w:val="nil"/>
+                <w:left w:space="0" w:sz="0" w:val="nil"/>
+                <w:bottom w:space="0" w:sz="0" w:val="nil"/>
+                <w:right w:space="0" w:sz="0" w:val="nil"/>
+                <w:between w:space="0" w:sz="0" w:val="nil"/>
+              </w:pBdr>
+              <w:shd w:fill="auto" w:val="clear"/>
+              <w:spacing w:after="0" w:before="0" w:line="240" w:lineRule="auto"/>
+              <w:ind w:left="0" w:right="0" w:firstLine="0"/>
+              <w:jc w:val="center"/>
+              <w:rPr>
+                <w:b w:val="1"/>
+                <w:bCs w:val="1"/>
+                <w:color w:val="1a1c1e"/>
+                <w:sz w:val="20"/>
+                <w:szCs w:val="20"/>
+              </w:rPr>
+            </w:pPr>
+            <w:r>
+              <w:rPr>
+                <w:rtl w:val="0"/>
+              </w:rPr>
+            </w:r>
+          </w:p>
+        </w:tc>
+        <w:tc>
+          <w:tcPr>
+            <w:shd w:fill="auto" w:val="clear"/>
+            <w:tcMar>
+              <w:top w:w="100.0" w:type="dxa"/>
+              <w:left w:w="100.0" w:type="dxa"/>
+              <w:bottom w:w="100.0" w:type="dxa"/>
+              <w:right w:w="100.0" w:type="dxa"/>
+            </w:tcMar>
+            <w:vAlign w:val="top"/>
+          </w:tcPr>
+          <w:p>
+            <w:pPr>
+              <w:keepNext w:val="0"/>
+              <w:keepLines w:val="0"/>
+              <w:pageBreakBefore w:val="0"/>
+              <w:widowControl w:val="0"/>
+              <w:pBdr>
+                <w:top w:space="0" w:sz="0" w:val="nil"/>
+                <w:left w:space="0" w:sz="0" w:val="nil"/>
+                <w:bottom w:space="0" w:sz="0" w:val="nil"/>
+                <w:right w:space="0" w:sz="0" w:val="nil"/>
+                <w:between w:space="0" w:sz="0" w:val="nil"/>
+              </w:pBdr>
+              <w:shd w:fill="auto" w:val="clear"/>
+              <w:spacing w:after="0" w:before="0" w:line="240" w:lineRule="auto"/>
+              <w:ind w:left="0" w:right="0" w:firstLine="0"/>
+              <w:jc w:val="center"/>
               <w:rPr>
                 <w:b w:val="1"/>
                 <w:bCs w:val="1"/>
@@ -1670,10 +1959,125 @@
                 <w:sz w:val="20"/>
                 <w:szCs w:val="20"/>
                 <w:highlight w:val="white"/>
-                <w:rtl w:val="0"/>
-              </w:rPr>
-              <w:t xml:space="preserve">}</w:t>
-            </w:r>
+              </w:rPr>
+            </w:pPr>
+            <w:r>
+              <w:rPr>
+                <w:rtl w:val="0"/>
+              </w:rPr>
+            </w:r>
+          </w:p>
+        </w:tc>
+        <w:tc>
+          <w:tcPr>
+            <w:shd w:fill="auto" w:val="clear"/>
+            <w:tcMar>
+              <w:top w:w="100.0" w:type="dxa"/>
+              <w:left w:w="100.0" w:type="dxa"/>
+              <w:bottom w:w="100.0" w:type="dxa"/>
+              <w:right w:w="100.0" w:type="dxa"/>
+            </w:tcMar>
+            <w:vAlign w:val="top"/>
+          </w:tcPr>
+          <w:p>
+            <w:pPr>
+              <w:keepNext w:val="0"/>
+              <w:keepLines w:val="0"/>
+              <w:pageBreakBefore w:val="0"/>
+              <w:widowControl w:val="0"/>
+              <w:pBdr>
+                <w:top w:space="0" w:sz="0" w:val="nil"/>
+                <w:left w:space="0" w:sz="0" w:val="nil"/>
+                <w:bottom w:space="0" w:sz="0" w:val="nil"/>
+                <w:right w:space="0" w:sz="0" w:val="nil"/>
+                <w:between w:space="0" w:sz="0" w:val="nil"/>
+              </w:pBdr>
+              <w:shd w:fill="auto" w:val="clear"/>
+              <w:spacing w:after="0" w:before="0" w:line="240" w:lineRule="auto"/>
+              <w:ind w:left="0" w:right="0" w:firstLine="0"/>
+              <w:jc w:val="center"/>
+              <w:rPr>
+                <w:b w:val="1"/>
+                <w:bCs w:val="1"/>
+                <w:color w:val="1a1c1e"/>
+                <w:sz w:val="20"/>
+                <w:szCs w:val="20"/>
+              </w:rPr>
+            </w:pPr>
+            <w:r>
+              <w:rPr>
+                <w:rtl w:val="0"/>
+              </w:rPr>
+            </w:r>
+          </w:p>
+        </w:tc>
+        <w:tc>
+          <w:tcPr>
+            <w:shd w:fill="auto" w:val="clear"/>
+            <w:tcMar>
+              <w:top w:w="100.0" w:type="dxa"/>
+              <w:left w:w="100.0" w:type="dxa"/>
+              <w:bottom w:w="100.0" w:type="dxa"/>
+              <w:right w:w="100.0" w:type="dxa"/>
+            </w:tcMar>
+            <w:vAlign w:val="top"/>
+          </w:tcPr>
+          <w:p>
+            <w:pPr>
+              <w:keepNext w:val="0"/>
+              <w:keepLines w:val="0"/>
+              <w:pageBreakBefore w:val="0"/>
+              <w:widowControl w:val="0"/>
+              <w:pBdr>
+                <w:top w:space="0" w:sz="0" w:val="nil"/>
+                <w:left w:space="0" w:sz="0" w:val="nil"/>
+                <w:bottom w:space="0" w:sz="0" w:val="nil"/>
+                <w:right w:space="0" w:sz="0" w:val="nil"/>
+                <w:between w:space="0" w:sz="0" w:val="nil"/>
+              </w:pBdr>
+              <w:shd w:fill="auto" w:val="clear"/>
+              <w:spacing w:after="0" w:before="0" w:line="240" w:lineRule="auto"/>
+              <w:ind w:left="0" w:right="0" w:firstLine="0"/>
+              <w:jc w:val="center"/>
+              <w:rPr>
+                <w:b w:val="1"/>
+                <w:bCs w:val="1"/>
+                <w:color w:val="1a1c1e"/>
+                <w:sz w:val="20"/>
+                <w:szCs w:val="20"/>
+                <w:highlight w:val="white"/>
+              </w:rPr>
+            </w:pPr>
+            <w:r>
+              <w:rPr>
+                <w:rtl w:val="0"/>
+              </w:rPr>
+            </w:r>
+          </w:p>
+        </w:tc>
+        <w:tc>
+          <w:tcPr>
+            <w:shd w:fill="auto" w:val="clear"/>
+            <w:tcMar>
+              <w:top w:w="100.0" w:type="dxa"/>
+              <w:left w:w="100.0" w:type="dxa"/>
+              <w:bottom w:w="100.0" w:type="dxa"/>
+              <w:right w:w="100.0" w:type="dxa"/>
+            </w:tcMar>
+            <w:vAlign w:val="top"/>
+          </w:tcPr>
+          <w:p>
+            <w:pPr>
+              <w:ind w:left="-141.7322834645671" w:right="-82.32283464566933" w:firstLine="0"/>
+              <w:jc w:val="center"/>
+              <w:rPr>
+                <w:b w:val="1"/>
+                <w:bCs w:val="1"/>
+                <w:color w:val="1a1c1e"/>
+                <w:sz w:val="20"/>
+                <w:szCs w:val="20"/>
+              </w:rPr>
+            </w:pPr>
             <w:r>
               <w:rPr>
                 <w:rtl w:val="0"/>
@@ -2818,7 +3222,23 @@
                 <w:szCs w:val="24"/>
                 <w:rtl w:val="0"/>
               </w:rPr>
-              <w:t xml:space="preserve"> {nombre_proveedor_oferente_au_au}</w:t>
+              <w:t xml:space="preserve"> </w:t>
+            </w:r>
+            <w:r>
+              <w:rPr>
+                <w:b w:val="1"/>
+                <w:bCs w:val="1"/>
+                <w:color w:val="1a1c1e"/>
+                <w:sz w:val="24"/>
+                <w:szCs w:val="24"/>
+                <w:rtl w:val="0"/>
+              </w:rPr>
+              <w:t xml:space="preserve">_____________________</w:t>
+            </w:r>
+            <w:r>
+              <w:rPr>
+                <w:rtl w:val="0"/>
+              </w:rPr>
             </w:r>
           </w:p>
         </w:tc>
@@ -2873,7 +3293,23 @@
                 <w:szCs w:val="24"/>
                 <w:rtl w:val="0"/>
               </w:rPr>
-              <w:t xml:space="preserve"> {nombre_rep_legal_oferente_au_au}</w:t>
+              <w:t xml:space="preserve"> </w:t>
+            </w:r>
+            <w:r>
+              <w:rPr>
+                <w:b w:val="1"/>
+                <w:bCs w:val="1"/>
+                <w:color w:val="1a1c1e"/>
+                <w:sz w:val="24"/>
+                <w:szCs w:val="24"/>
+                <w:rtl w:val="0"/>
+              </w:rPr>
+              <w:t xml:space="preserve">______________________</w:t>
+            </w:r>
+            <w:r>
+              <w:rPr>
+                <w:rtl w:val="0"/>
+              </w:rPr>
             </w:r>
           </w:p>
         </w:tc>
@@ -2928,7 +3364,23 @@
                 <w:szCs w:val="24"/>
                 <w:rtl w:val="0"/>
               </w:rPr>
-              <w:t xml:space="preserve"> {cedula_rep_legal_oferente_au_au}</w:t>
+              <w:t xml:space="preserve"> </w:t>
+            </w:r>
+            <w:r>
+              <w:rPr>
+                <w:b w:val="1"/>
+                <w:bCs w:val="1"/>
+                <w:color w:val="1a1c1e"/>
+                <w:sz w:val="24"/>
+                <w:szCs w:val="24"/>
+                <w:rtl w:val="0"/>
+              </w:rPr>
+              <w:t xml:space="preserve">________________________</w:t>
+            </w:r>
+            <w:r>
+              <w:rPr>
+                <w:rtl w:val="0"/>
+              </w:rPr>
             </w:r>
           </w:p>
         </w:tc>
@@ -2948,12 +3400,73 @@
       </w:r>
     </w:p>
     <w:sectPr>
+      <w:headerReference r:id="rId6" w:type="default"/>
       <w:pgSz w:h="16834" w:w="11909" w:orient="portrait"/>
-      <w:pgMar w:bottom="1440" w:top="1440" w:left="1440" w:right="1440" w:header="720" w:footer="720"/>
+      <w:pgMar w:bottom="1440" w:top="1440" w:left="1440" w:right="1440" w:header="113.38582677165356" w:footer="720"/>
       <w:pgNumType w:start="1"/>
     </w:sectPr>
   </w:body>
 </w:document>
+</file>
+
+<file path=word/header1.xml><?xml version="1.0" encoding="utf-8"?>
+<w:hdr xmlns:mc="http://schemas.openxmlformats.org/markup-compatibility/2006" xmlns:o="urn:schemas-microsoft-com:office:office" xmlns:r="http://schemas.openxmlformats.org/officeDocument/2006/relationships" xmlns:m="http://schemas.openxmlformats.org/officeDocument/2006/math" xmlns:v="urn:schemas-microsoft-com:vml" xmlns:wp="http://schemas.openxmlformats.org/drawingml/2006/wordprocessingDrawing" xmlns:w10="urn:schemas-microsoft-com:office:word" xmlns:w="http://schemas.openxmlformats.org/wordprocessingml/2006/main" xmlns:wne="http://schemas.microsoft.com/office/word/2006/wordml" xmlns:sl="http://schemas.openxmlformats.org/schemaLibrary/2006/main" xmlns:a="http://schemas.openxmlformats.org/drawingml/2006/main" xmlns:pic="http://schemas.openxmlformats.org/drawingml/2006/picture" xmlns:c="http://schemas.openxmlformats.org/drawingml/2006/chart" xmlns:lc="http://schemas.openxmlformats.org/drawingml/2006/lockedCanvas" xmlns:dgm="http://schemas.openxmlformats.org/drawingml/2006/diagram" xmlns:wps="http://schemas.microsoft.com/office/word/2010/wordprocessingShape" xmlns:wpg="http://schemas.microsoft.com/office/word/2010/wordprocessingGroup" xmlns:w14="http://schemas.microsoft.com/office/word/2010/wordml" xmlns:w15="http://schemas.microsoft.com/office/word/2012/wordml" xmlns:w16="http://schemas.microsoft.com/office/word/2018/wordml" xmlns:w16cex="http://schemas.microsoft.com/office/word/2018/wordml/cex" xmlns:w16cid="http://schemas.microsoft.com/office/word/2016/wordml/cid" xmlns="http://schemas.microsoft.com/office/tasks/2019/documenttasks" xmlns:cr="http://schemas.microsoft.com/office/comments/2020/reactions">
+  <w:p>
+    <w:pPr>
+      <w:shd w:fill="ffffff" w:val="clear"/>
+      <w:spacing w:before="0" w:line="240" w:lineRule="auto"/>
+      <w:jc w:val="center"/>
+      <w:rPr>
+        <w:b w:val="1"/>
+        <w:bCs w:val="1"/>
+        <w:color w:val="1a1c1e"/>
+        <w:sz w:val="24"/>
+        <w:szCs w:val="24"/>
+      </w:rPr>
+    </w:pPr>
+    <w:r>
+      <w:rPr>
+        <w:b w:val="1"/>
+        <w:bCs w:val="1"/>
+        <w:color w:val="1a1c1e"/>
+        <w:sz w:val="24"/>
+        <w:szCs w:val="24"/>
+        <w:rtl w:val="0"/>
+      </w:rPr>
+      <w:t xml:space="preserve">REPÚBLICA BOLIVARIANA DE VENEZUELA</w:t>
+      <w:br w:type="textWrapping"/>
+      <w:t xml:space="preserve">{nom_ente_contratante}</w:t>
+      <w:br w:type="textWrapping"/>
+      <w:t xml:space="preserve">COMISIÓN DE CONTRATACIONES PÚBLICAS</w:t>
+    </w:r>
+  </w:p>
+  <w:p>
+    <w:pPr>
+      <w:shd w:fill="ffffff" w:val="clear"/>
+      <w:spacing w:after="0" w:line="240" w:lineRule="auto"/>
+      <w:jc w:val="center"/>
+      <w:rPr/>
+    </w:pPr>
+    <w:r>
+      <w:rPr>
+        <w:b w:val="1"/>
+        <w:bCs w:val="1"/>
+        <w:color w:val="1a1c1e"/>
+        <w:sz w:val="24"/>
+        <w:szCs w:val="24"/>
+        <w:rtl w:val="0"/>
+      </w:rPr>
+      <w:t xml:space="preserve">{desc_objeto_contratacion}</w:t>
+      <w:br w:type="textWrapping"/>
+      <w:t xml:space="preserve">N° {cod_nomenclatura_proceso}</w:t>
+    </w:r>
+    <w:r>
+      <w:rPr>
+        <w:rtl w:val="0"/>
+      </w:rPr>
+    </w:r>
+  </w:p>
+</w:hdr>
 </file>
 
 <file path=word/numbering.xml><?xml version="1.0" encoding="utf-8"?>

</xml_diff>